<commit_message>
Appointment letters: justify at word gaps instead of Thai distribute
Co-Authored-By: Claude Opus 5.5 <noreply@anthropic.com>
Claude-Session: https://claude.ai/code/session_01FapC72tTBB8AqE8phsKq6c
</commit_message>
<xml_diff>
--- a/exam-duty-dashboard/แม่แบบคำสั่งกรรมการคุมสอบ_ปลายภาค1-2569.docx
+++ b/exam-duty-dashboard/แม่แบบคำสั่งกรรมการคุมสอบ_ปลายภาค1-2569.docx
@@ -96,7 +96,7 @@
       <w:pPr>
         <w:spacing w:after="0" w:before="0" w:line="240"/>
         <w:ind w:firstLine="1134"/>
-        <w:jc w:val="thaiDistribute"/>
+        <w:jc w:val="both"/>
       </w:pPr>
       <w:r>
         <w:rPr>
@@ -111,7 +111,7 @@
       <w:pPr>
         <w:spacing w:after="0" w:before="0" w:line="240"/>
         <w:ind w:firstLine="1134"/>
-        <w:jc w:val="thaiDistribute"/>
+        <w:jc w:val="both"/>
       </w:pPr>
       <w:r>
         <w:rPr>
@@ -126,7 +126,7 @@
       <w:pPr>
         <w:spacing w:after="0" w:before="0" w:line="240"/>
         <w:ind w:firstLine="1134"/>
-        <w:jc w:val="thaiDistribute"/>
+        <w:jc w:val="both"/>
       </w:pPr>
       <w:r>
         <w:rPr>
@@ -141,7 +141,7 @@
       <w:pPr>
         <w:spacing w:after="0" w:before="0" w:line="240"/>
         <w:ind w:firstLine="1134"/>
-        <w:jc w:val="thaiDistribute"/>
+        <w:jc w:val="both"/>
       </w:pPr>
       <w:r>
         <w:rPr>
@@ -156,7 +156,7 @@
       <w:pPr>
         <w:spacing w:after="0" w:before="0" w:line="240"/>
         <w:ind w:firstLine="1418"/>
-        <w:jc w:val="thaiDistribute"/>
+        <w:jc w:val="both"/>
       </w:pPr>
       <w:r>
         <w:rPr>
@@ -171,7 +171,7 @@
       <w:pPr>
         <w:spacing w:after="0" w:before="0" w:line="240"/>
         <w:ind w:firstLine="1418"/>
-        <w:jc w:val="thaiDistribute"/>
+        <w:jc w:val="both"/>
       </w:pPr>
       <w:r>
         <w:rPr>
@@ -186,7 +186,7 @@
       <w:pPr>
         <w:spacing w:after="0" w:before="0" w:line="240"/>
         <w:ind w:firstLine="1134"/>
-        <w:jc w:val="thaiDistribute"/>
+        <w:jc w:val="both"/>
       </w:pPr>
       <w:r>
         <w:rPr>
@@ -1122,7 +1122,7 @@
       <w:pPr>
         <w:spacing w:after="0" w:before="0" w:line="240"/>
         <w:ind w:firstLine="1134"/>
-        <w:jc w:val="thaiDistribute"/>
+        <w:jc w:val="both"/>
       </w:pPr>
       <w:r>
         <w:rPr>

</xml_diff>

<commit_message>
Appointment letters: drop the duty column and room-opening rows, AUD 50 as full name in 10pt
Co-Authored-By: Claude Opus 5.5 <noreply@anthropic.com>
Claude-Session: https://claude.ai/code/session_01FapC72tTBB8AqE8phsKq6c
</commit_message>
<xml_diff>
--- a/exam-duty-dashboard/แม่แบบคำสั่งกรรมการคุมสอบ_ปลายภาค1-2569.docx
+++ b/exam-duty-dashboard/แม่แบบคำสั่งกรรมการคุมสอบ_ปลายภาค1-2569.docx
@@ -429,12 +429,11 @@
         <w:tblLook w:val="0000" w:firstRow="0" w:lastRow="0" w:firstColumn="0" w:lastColumn="0" w:noHBand="0" w:noVBand="0"/>
       </w:tblPr>
       <w:tblGrid>
-        <w:gridCol w:w="798"/>
-        <w:gridCol w:w="2038"/>
-        <w:gridCol w:w="1345"/>
-        <w:gridCol w:w="1844"/>
-        <w:gridCol w:w="1834"/>
-        <w:gridCol w:w="1495"/>
+        <w:gridCol w:w="800"/>
+        <w:gridCol w:w="2100"/>
+        <w:gridCol w:w="1450"/>
+        <w:gridCol w:w="2500"/>
+        <w:gridCol w:w="2504"/>
       </w:tblGrid>
       <w:tr>
         <w:tblPrEx>
@@ -479,7 +478,7 @@
         </w:tc>
         <w:tc>
           <w:tcPr>
-            <w:tcW w:w="2050" w:type="dxa"/>
+            <w:tcW w:w="2100" w:type="dxa"/>
             <w:tcBorders>
               <w:top w:val="single" w:sz="6" w:space="0" w:color="000000"/>
               <w:left w:val="single" w:sz="6" w:space="0" w:color="000000"/>
@@ -510,7 +509,7 @@
         </w:tc>
         <w:tc>
           <w:tcPr>
-            <w:tcW w:w="1350" w:type="dxa"/>
+            <w:tcW w:w="1450" w:type="dxa"/>
             <w:tcBorders>
               <w:top w:val="single" w:sz="6" w:space="0" w:color="000000"/>
               <w:left w:val="single" w:sz="6" w:space="0" w:color="000000"/>
@@ -541,7 +540,7 @@
         </w:tc>
         <w:tc>
           <w:tcPr>
-            <w:tcW w:w="1850" w:type="dxa"/>
+            <w:tcW w:w="2500" w:type="dxa"/>
             <w:tcBorders>
               <w:top w:val="single" w:sz="6" w:space="0" w:color="000000"/>
               <w:left w:val="single" w:sz="6" w:space="0" w:color="000000"/>
@@ -572,7 +571,7 @@
         </w:tc>
         <w:tc>
           <w:tcPr>
-            <w:tcW w:w="1804" w:type="dxa"/>
+            <w:tcW w:w="2504" w:type="dxa"/>
             <w:tcBorders>
               <w:top w:val="single" w:sz="6" w:space="0" w:color="000000"/>
               <w:left w:val="single" w:sz="6" w:space="0" w:color="000000"/>
@@ -598,37 +597,6 @@
                 <w:szCs w:val="30"/>
               </w:rPr>
               <w:t>กระบวนวิชา/ตอน</w:t>
-            </w:r>
-          </w:p>
-        </w:tc>
-        <w:tc>
-          <w:tcPr>
-            <w:tcW w:w="1500" w:type="dxa"/>
-            <w:tcBorders>
-              <w:top w:val="single" w:sz="6" w:space="0" w:color="000000"/>
-              <w:left w:val="single" w:sz="6" w:space="0" w:color="000000"/>
-              <w:bottom w:val="single" w:sz="6" w:space="0" w:color="000000"/>
-              <w:right w:val="single" w:sz="6" w:space="0" w:color="000000"/>
-            </w:tcBorders>
-            <w:tcMar>
-              <w:top w:w="20" w:type="dxa"/>
-              <w:left w:w="80" w:type="dxa"/>
-              <w:bottom w:w="20" w:type="dxa"/>
-              <w:right w:w="80" w:type="dxa"/>
-            </w:tcMar>
-          </w:tcPr>
-          <w:p>
-            <w:pPr>
-              <w:jc w:val="center"/>
-            </w:pPr>
-            <w:r>
-              <w:rPr>
-                <w:b/>
-                <w:bCs/>
-                <w:sz w:val="30"/>
-                <w:szCs w:val="30"/>
-              </w:rPr>
-              <w:t>หน้าที่</w:t>
             </w:r>
           </w:p>
         </w:tc>
@@ -675,7 +643,7 @@
         </w:tc>
         <w:tc>
           <w:tcPr>
-            <w:tcW w:w="2050" w:type="dxa"/>
+            <w:tcW w:w="2100" w:type="dxa"/>
             <w:tcBorders>
               <w:top w:val="single" w:sz="6" w:space="0" w:color="000000"/>
               <w:left w:val="single" w:sz="6" w:space="0" w:color="000000"/>
@@ -702,7 +670,7 @@
         </w:tc>
         <w:tc>
           <w:tcPr>
-            <w:tcW w:w="1350" w:type="dxa"/>
+            <w:tcW w:w="1450" w:type="dxa"/>
             <w:tcBorders>
               <w:top w:val="single" w:sz="6" w:space="0" w:color="000000"/>
               <w:left w:val="single" w:sz="6" w:space="0" w:color="000000"/>
@@ -732,7 +700,7 @@
         </w:tc>
         <w:tc>
           <w:tcPr>
-            <w:tcW w:w="1850" w:type="dxa"/>
+            <w:tcW w:w="2500" w:type="dxa"/>
             <w:tcBorders>
               <w:top w:val="single" w:sz="6" w:space="0" w:color="000000"/>
               <w:left w:val="single" w:sz="6" w:space="0" w:color="000000"/>
@@ -759,7 +727,7 @@
         </w:tc>
         <w:tc>
           <w:tcPr>
-            <w:tcW w:w="1804" w:type="dxa"/>
+            <w:tcW w:w="2504" w:type="dxa"/>
             <w:tcBorders>
               <w:top w:val="single" w:sz="6" w:space="0" w:color="000000"/>
               <w:left w:val="single" w:sz="6" w:space="0" w:color="000000"/>
@@ -781,33 +749,6 @@
                 <w:highlight w:val="yellow"/>
               </w:rPr>
               <w:t>{{กระบวนวิชา/ตอน}}</w:t>
-            </w:r>
-          </w:p>
-        </w:tc>
-        <w:tc>
-          <w:tcPr>
-            <w:tcW w:w="1500" w:type="dxa"/>
-            <w:tcBorders>
-              <w:top w:val="single" w:sz="6" w:space="0" w:color="000000"/>
-              <w:left w:val="single" w:sz="6" w:space="0" w:color="000000"/>
-              <w:bottom w:val="single" w:sz="6" w:space="0" w:color="000000"/>
-              <w:right w:val="single" w:sz="6" w:space="0" w:color="000000"/>
-            </w:tcBorders>
-            <w:tcMar>
-              <w:top w:w="20" w:type="dxa"/>
-              <w:left w:w="80" w:type="dxa"/>
-              <w:bottom w:w="20" w:type="dxa"/>
-              <w:right w:w="80" w:type="dxa"/>
-            </w:tcMar>
-          </w:tcPr>
-          <w:p>
-            <w:r>
-              <w:rPr>
-                <w:sz w:val="30"/>
-                <w:szCs w:val="30"/>
-                <w:highlight w:val="yellow"/>
-              </w:rPr>
-              <w:t>{{หน้าที่}}</w:t>
             </w:r>
           </w:p>
         </w:tc>
@@ -854,7 +795,7 @@
         </w:tc>
         <w:tc>
           <w:tcPr>
-            <w:tcW w:w="2050" w:type="dxa"/>
+            <w:tcW w:w="2100" w:type="dxa"/>
             <w:tcBorders>
               <w:top w:val="single" w:sz="6" w:space="0" w:color="000000"/>
               <w:left w:val="single" w:sz="6" w:space="0" w:color="000000"/>
@@ -881,7 +822,7 @@
         </w:tc>
         <w:tc>
           <w:tcPr>
-            <w:tcW w:w="1350" w:type="dxa"/>
+            <w:tcW w:w="1450" w:type="dxa"/>
             <w:tcBorders>
               <w:top w:val="single" w:sz="6" w:space="0" w:color="000000"/>
               <w:left w:val="single" w:sz="6" w:space="0" w:color="000000"/>
@@ -911,7 +852,7 @@
         </w:tc>
         <w:tc>
           <w:tcPr>
-            <w:tcW w:w="1850" w:type="dxa"/>
+            <w:tcW w:w="2500" w:type="dxa"/>
             <w:tcBorders>
               <w:top w:val="single" w:sz="6" w:space="0" w:color="000000"/>
               <w:left w:val="single" w:sz="6" w:space="0" w:color="000000"/>
@@ -938,7 +879,7 @@
         </w:tc>
         <w:tc>
           <w:tcPr>
-            <w:tcW w:w="1804" w:type="dxa"/>
+            <w:tcW w:w="2504" w:type="dxa"/>
             <w:tcBorders>
               <w:top w:val="single" w:sz="6" w:space="0" w:color="000000"/>
               <w:left w:val="single" w:sz="6" w:space="0" w:color="000000"/>
@@ -960,33 +901,6 @@
                 <w:highlight w:val="yellow"/>
               </w:rPr>
               <w:t>{{กระบวนวิชา/ตอน}}</w:t>
-            </w:r>
-          </w:p>
-        </w:tc>
-        <w:tc>
-          <w:tcPr>
-            <w:tcW w:w="1500" w:type="dxa"/>
-            <w:tcBorders>
-              <w:top w:val="single" w:sz="6" w:space="0" w:color="000000"/>
-              <w:left w:val="single" w:sz="6" w:space="0" w:color="000000"/>
-              <w:bottom w:val="single" w:sz="6" w:space="0" w:color="000000"/>
-              <w:right w:val="single" w:sz="6" w:space="0" w:color="000000"/>
-            </w:tcBorders>
-            <w:tcMar>
-              <w:top w:w="20" w:type="dxa"/>
-              <w:left w:w="80" w:type="dxa"/>
-              <w:bottom w:w="20" w:type="dxa"/>
-              <w:right w:w="80" w:type="dxa"/>
-            </w:tcMar>
-          </w:tcPr>
-          <w:p>
-            <w:r>
-              <w:rPr>
-                <w:sz w:val="30"/>
-                <w:szCs w:val="30"/>
-                <w:highlight w:val="yellow"/>
-              </w:rPr>
-              <w:t>{{หน้าที่}}</w:t>
             </w:r>
           </w:p>
         </w:tc>
@@ -1033,7 +947,7 @@
         </w:tc>
         <w:tc>
           <w:tcPr>
-            <w:tcW w:w="2050" w:type="dxa"/>
+            <w:tcW w:w="2100" w:type="dxa"/>
             <w:tcBorders>
               <w:top w:val="single" w:sz="6" w:space="0" w:color="000000"/>
               <w:left w:val="single" w:sz="6" w:space="0" w:color="000000"/>
@@ -1060,7 +974,7 @@
         </w:tc>
         <w:tc>
           <w:tcPr>
-            <w:tcW w:w="1350" w:type="dxa"/>
+            <w:tcW w:w="1450" w:type="dxa"/>
             <w:tcBorders>
               <w:top w:val="single" w:sz="6" w:space="0" w:color="000000"/>
               <w:left w:val="single" w:sz="6" w:space="0" w:color="000000"/>
@@ -1090,7 +1004,7 @@
         </w:tc>
         <w:tc>
           <w:tcPr>
-            <w:tcW w:w="1850" w:type="dxa"/>
+            <w:tcW w:w="2500" w:type="dxa"/>
             <w:tcBorders>
               <w:top w:val="single" w:sz="6" w:space="0" w:color="000000"/>
               <w:left w:val="single" w:sz="6" w:space="0" w:color="000000"/>
@@ -1117,7 +1031,7 @@
         </w:tc>
         <w:tc>
           <w:tcPr>
-            <w:tcW w:w="1804" w:type="dxa"/>
+            <w:tcW w:w="2504" w:type="dxa"/>
             <w:tcBorders>
               <w:top w:val="single" w:sz="6" w:space="0" w:color="000000"/>
               <w:left w:val="single" w:sz="6" w:space="0" w:color="000000"/>
@@ -1139,33 +1053,6 @@
                 <w:highlight w:val="yellow"/>
               </w:rPr>
               <w:t>{{กระบวนวิชา/ตอน}}</w:t>
-            </w:r>
-          </w:p>
-        </w:tc>
-        <w:tc>
-          <w:tcPr>
-            <w:tcW w:w="1500" w:type="dxa"/>
-            <w:tcBorders>
-              <w:top w:val="single" w:sz="6" w:space="0" w:color="000000"/>
-              <w:left w:val="single" w:sz="6" w:space="0" w:color="000000"/>
-              <w:bottom w:val="single" w:sz="6" w:space="0" w:color="000000"/>
-              <w:right w:val="single" w:sz="6" w:space="0" w:color="000000"/>
-            </w:tcBorders>
-            <w:tcMar>
-              <w:top w:w="20" w:type="dxa"/>
-              <w:left w:w="80" w:type="dxa"/>
-              <w:bottom w:w="20" w:type="dxa"/>
-              <w:right w:w="80" w:type="dxa"/>
-            </w:tcMar>
-          </w:tcPr>
-          <w:p>
-            <w:r>
-              <w:rPr>
-                <w:sz w:val="30"/>
-                <w:szCs w:val="30"/>
-                <w:highlight w:val="yellow"/>
-              </w:rPr>
-              <w:t>{{หน้าที่}}</w:t>
             </w:r>
           </w:p>
         </w:tc>

</xml_diff>

<commit_message>
Appointment letters: table data cells left-aligned, vertically centred
Co-Authored-By: Claude Opus 5.5 <noreply@anthropic.com>
Claude-Session: https://claude.ai/code/session_01FapC72tTBB8AqE8phsKq6c
</commit_message>
<xml_diff>
--- a/exam-duty-dashboard/แม่แบบคำสั่งกรรมการคุมสอบ_ปลายภาค1-2569.docx
+++ b/exam-duty-dashboard/แม่แบบคำสั่งกรรมการคุมสอบ_ปลายภาค1-2569.docx
@@ -626,10 +626,11 @@
               <w:bottom w:w="20" w:type="dxa"/>
               <w:right w:w="80" w:type="dxa"/>
             </w:tcMar>
+            <w:vAlign w:val="center"/>
           </w:tcPr>
           <w:p>
             <w:pPr>
-              <w:jc w:val="center"/>
+              <w:jc w:val="left"/>
             </w:pPr>
             <w:r>
               <w:rPr>
@@ -656,8 +657,12 @@
               <w:bottom w:w="20" w:type="dxa"/>
               <w:right w:w="80" w:type="dxa"/>
             </w:tcMar>
+            <w:vAlign w:val="center"/>
           </w:tcPr>
           <w:p>
+            <w:pPr>
+              <w:jc w:val="left"/>
+            </w:pPr>
             <w:r>
               <w:rPr>
                 <w:sz w:val="30"/>
@@ -683,10 +688,11 @@
               <w:bottom w:w="20" w:type="dxa"/>
               <w:right w:w="80" w:type="dxa"/>
             </w:tcMar>
+            <w:vAlign w:val="center"/>
           </w:tcPr>
           <w:p>
             <w:pPr>
-              <w:jc w:val="center"/>
+              <w:jc w:val="left"/>
             </w:pPr>
             <w:r>
               <w:rPr>
@@ -713,8 +719,12 @@
               <w:bottom w:w="20" w:type="dxa"/>
               <w:right w:w="80" w:type="dxa"/>
             </w:tcMar>
+            <w:vAlign w:val="center"/>
           </w:tcPr>
           <w:p>
+            <w:pPr>
+              <w:jc w:val="left"/>
+            </w:pPr>
             <w:r>
               <w:rPr>
                 <w:sz w:val="30"/>
@@ -740,8 +750,12 @@
               <w:bottom w:w="20" w:type="dxa"/>
               <w:right w:w="80" w:type="dxa"/>
             </w:tcMar>
+            <w:vAlign w:val="center"/>
           </w:tcPr>
           <w:p>
+            <w:pPr>
+              <w:jc w:val="left"/>
+            </w:pPr>
             <w:r>
               <w:rPr>
                 <w:sz w:val="30"/>
@@ -778,10 +792,11 @@
               <w:bottom w:w="20" w:type="dxa"/>
               <w:right w:w="80" w:type="dxa"/>
             </w:tcMar>
+            <w:vAlign w:val="center"/>
           </w:tcPr>
           <w:p>
             <w:pPr>
-              <w:jc w:val="center"/>
+              <w:jc w:val="left"/>
             </w:pPr>
             <w:r>
               <w:rPr>
@@ -808,8 +823,12 @@
               <w:bottom w:w="20" w:type="dxa"/>
               <w:right w:w="80" w:type="dxa"/>
             </w:tcMar>
+            <w:vAlign w:val="center"/>
           </w:tcPr>
           <w:p>
+            <w:pPr>
+              <w:jc w:val="left"/>
+            </w:pPr>
             <w:r>
               <w:rPr>
                 <w:sz w:val="30"/>
@@ -835,10 +854,11 @@
               <w:bottom w:w="20" w:type="dxa"/>
               <w:right w:w="80" w:type="dxa"/>
             </w:tcMar>
+            <w:vAlign w:val="center"/>
           </w:tcPr>
           <w:p>
             <w:pPr>
-              <w:jc w:val="center"/>
+              <w:jc w:val="left"/>
             </w:pPr>
             <w:r>
               <w:rPr>
@@ -865,8 +885,12 @@
               <w:bottom w:w="20" w:type="dxa"/>
               <w:right w:w="80" w:type="dxa"/>
             </w:tcMar>
+            <w:vAlign w:val="center"/>
           </w:tcPr>
           <w:p>
+            <w:pPr>
+              <w:jc w:val="left"/>
+            </w:pPr>
             <w:r>
               <w:rPr>
                 <w:sz w:val="30"/>
@@ -892,8 +916,12 @@
               <w:bottom w:w="20" w:type="dxa"/>
               <w:right w:w="80" w:type="dxa"/>
             </w:tcMar>
+            <w:vAlign w:val="center"/>
           </w:tcPr>
           <w:p>
+            <w:pPr>
+              <w:jc w:val="left"/>
+            </w:pPr>
             <w:r>
               <w:rPr>
                 <w:sz w:val="30"/>
@@ -930,10 +958,11 @@
               <w:bottom w:w="20" w:type="dxa"/>
               <w:right w:w="80" w:type="dxa"/>
             </w:tcMar>
+            <w:vAlign w:val="center"/>
           </w:tcPr>
           <w:p>
             <w:pPr>
-              <w:jc w:val="center"/>
+              <w:jc w:val="left"/>
             </w:pPr>
             <w:r>
               <w:rPr>
@@ -960,8 +989,12 @@
               <w:bottom w:w="20" w:type="dxa"/>
               <w:right w:w="80" w:type="dxa"/>
             </w:tcMar>
+            <w:vAlign w:val="center"/>
           </w:tcPr>
           <w:p>
+            <w:pPr>
+              <w:jc w:val="left"/>
+            </w:pPr>
             <w:r>
               <w:rPr>
                 <w:sz w:val="30"/>
@@ -987,10 +1020,11 @@
               <w:bottom w:w="20" w:type="dxa"/>
               <w:right w:w="80" w:type="dxa"/>
             </w:tcMar>
+            <w:vAlign w:val="center"/>
           </w:tcPr>
           <w:p>
             <w:pPr>
-              <w:jc w:val="center"/>
+              <w:jc w:val="left"/>
             </w:pPr>
             <w:r>
               <w:rPr>
@@ -1017,8 +1051,12 @@
               <w:bottom w:w="20" w:type="dxa"/>
               <w:right w:w="80" w:type="dxa"/>
             </w:tcMar>
+            <w:vAlign w:val="center"/>
           </w:tcPr>
           <w:p>
+            <w:pPr>
+              <w:jc w:val="left"/>
+            </w:pPr>
             <w:r>
               <w:rPr>
                 <w:sz w:val="30"/>
@@ -1044,8 +1082,12 @@
               <w:bottom w:w="20" w:type="dxa"/>
               <w:right w:w="80" w:type="dxa"/>
             </w:tcMar>
+            <w:vAlign w:val="center"/>
           </w:tcPr>
           <w:p>
+            <w:pPr>
+              <w:jc w:val="left"/>
+            </w:pPr>
             <w:r>
               <w:rPr>
                 <w:sz w:val="30"/>

</xml_diff>